<commit_message>
learnt Devops theory added notes
</commit_message>
<xml_diff>
--- a/DevOps_RDMP/DevOps_Notes/DEVOPS.docx
+++ b/DevOps_RDMP/DevOps_Notes/DEVOPS.docx
@@ -245,6 +245,14 @@
         </w:rPr>
         <w:t>EC2 stands for Elastic Compute Cloud.</w:t>
       </w:r>
+    </w:p>
+    <w:p>
+      <w:pPr>
+        <w:rPr>
+          <w:b/>
+          <w:bCs/>
+        </w:rPr>
+      </w:pPr>
     </w:p>
     <w:p>
       <w:pPr>

</xml_diff>